<commit_message>
docs(matrices-riesgos): aprobar documento maestro v1.2
</commit_message>
<xml_diff>
--- a/Analisis Matrices de riesgos v2/Analisis_Definitivo_Modulo_Matrices_de_Riesgos.docx
+++ b/Analisis Matrices de riesgos v2/Analisis_Definitivo_Modulo_Matrices_de_Riesgos.docx
@@ -202,7 +202,7 @@
                 <w:color w:val="000000"/>
                 <w:sz w:val="18"/>
               </w:rPr>
-              <w:t>Análisis definitivo del módulo Matrices de Riesgos</w:t>
+              <w:t>Análisis Maestro y Plan Definitivo de Implementación del Módulo Matrices de Riesgos</w:t>
             </w:r>
           </w:p>
         </w:tc>
@@ -252,7 +252,7 @@
                 <w:color w:val="000000"/>
                 <w:sz w:val="18"/>
               </w:rPr>
-              <w:t>Versión final consolidada para implementación</w:t>
+              <w:t>Documento Maestro aprobado para implementación</w:t>
             </w:r>
           </w:p>
         </w:tc>
@@ -300,7 +300,7 @@
                 <w:color w:val="000000"/>
                 <w:sz w:val="18"/>
               </w:rPr>
-              <w:t>1.1</w:t>
+              <w:t>1.2</w:t>
             </w:r>
           </w:p>
         </w:tc>
@@ -6682,7 +6682,7 @@
         <w:widowControl/>
         <w:numPr>
           <w:ilvl w:val="0"/>
-          <w:numId w:val="11"/>
+          <w:numId w:val="12"/>
         </w:numPr>
         <w:spacing w:after="80" w:line="300" w:lineRule="auto"/>
       </w:pPr>
@@ -6702,7 +6702,7 @@
         <w:widowControl/>
         <w:numPr>
           <w:ilvl w:val="0"/>
-          <w:numId w:val="11"/>
+          <w:numId w:val="12"/>
         </w:numPr>
         <w:spacing w:after="80" w:line="300" w:lineRule="auto"/>
       </w:pPr>
@@ -6722,7 +6722,7 @@
         <w:widowControl/>
         <w:numPr>
           <w:ilvl w:val="0"/>
-          <w:numId w:val="11"/>
+          <w:numId w:val="12"/>
         </w:numPr>
         <w:spacing w:after="80" w:line="300" w:lineRule="auto"/>
       </w:pPr>
@@ -6742,7 +6742,7 @@
         <w:widowControl/>
         <w:numPr>
           <w:ilvl w:val="0"/>
-          <w:numId w:val="11"/>
+          <w:numId w:val="12"/>
         </w:numPr>
         <w:spacing w:after="80" w:line="300" w:lineRule="auto"/>
       </w:pPr>
@@ -6762,7 +6762,7 @@
         <w:widowControl/>
         <w:numPr>
           <w:ilvl w:val="0"/>
-          <w:numId w:val="11"/>
+          <w:numId w:val="12"/>
         </w:numPr>
         <w:spacing w:after="80" w:line="300" w:lineRule="auto"/>
       </w:pPr>
@@ -6782,7 +6782,7 @@
         <w:widowControl/>
         <w:numPr>
           <w:ilvl w:val="0"/>
-          <w:numId w:val="11"/>
+          <w:numId w:val="12"/>
         </w:numPr>
         <w:spacing w:after="80" w:line="300" w:lineRule="auto"/>
       </w:pPr>
@@ -6802,7 +6802,7 @@
         <w:widowControl/>
         <w:numPr>
           <w:ilvl w:val="0"/>
-          <w:numId w:val="11"/>
+          <w:numId w:val="12"/>
         </w:numPr>
         <w:spacing w:after="80" w:line="300" w:lineRule="auto"/>
       </w:pPr>
@@ -6822,7 +6822,7 @@
         <w:widowControl/>
         <w:numPr>
           <w:ilvl w:val="0"/>
-          <w:numId w:val="11"/>
+          <w:numId w:val="12"/>
         </w:numPr>
         <w:spacing w:after="80" w:line="300" w:lineRule="auto"/>
       </w:pPr>
@@ -6842,7 +6842,7 @@
         <w:widowControl/>
         <w:numPr>
           <w:ilvl w:val="0"/>
-          <w:numId w:val="11"/>
+          <w:numId w:val="12"/>
         </w:numPr>
         <w:spacing w:after="80" w:line="300" w:lineRule="auto"/>
       </w:pPr>
@@ -6862,7 +6862,7 @@
         <w:widowControl/>
         <w:numPr>
           <w:ilvl w:val="0"/>
-          <w:numId w:val="11"/>
+          <w:numId w:val="12"/>
         </w:numPr>
         <w:spacing w:after="80" w:line="300" w:lineRule="auto"/>
       </w:pPr>
@@ -6882,7 +6882,7 @@
         <w:widowControl/>
         <w:numPr>
           <w:ilvl w:val="0"/>
-          <w:numId w:val="11"/>
+          <w:numId w:val="12"/>
         </w:numPr>
         <w:spacing w:after="80" w:line="300" w:lineRule="auto"/>
       </w:pPr>
@@ -6912,7 +6912,7 @@
         <w:widowControl/>
         <w:numPr>
           <w:ilvl w:val="0"/>
-          <w:numId w:val="11"/>
+          <w:numId w:val="13"/>
         </w:numPr>
         <w:spacing w:after="80" w:line="300" w:lineRule="auto"/>
       </w:pPr>
@@ -6932,7 +6932,7 @@
         <w:widowControl/>
         <w:numPr>
           <w:ilvl w:val="0"/>
-          <w:numId w:val="11"/>
+          <w:numId w:val="13"/>
         </w:numPr>
         <w:spacing w:after="80" w:line="300" w:lineRule="auto"/>
       </w:pPr>
@@ -6952,7 +6952,7 @@
         <w:widowControl/>
         <w:numPr>
           <w:ilvl w:val="0"/>
-          <w:numId w:val="11"/>
+          <w:numId w:val="13"/>
         </w:numPr>
         <w:spacing w:after="80" w:line="300" w:lineRule="auto"/>
       </w:pPr>
@@ -6972,7 +6972,7 @@
         <w:widowControl/>
         <w:numPr>
           <w:ilvl w:val="0"/>
-          <w:numId w:val="11"/>
+          <w:numId w:val="13"/>
         </w:numPr>
         <w:spacing w:after="80" w:line="300" w:lineRule="auto"/>
       </w:pPr>
@@ -6992,7 +6992,7 @@
         <w:widowControl/>
         <w:numPr>
           <w:ilvl w:val="0"/>
-          <w:numId w:val="11"/>
+          <w:numId w:val="13"/>
         </w:numPr>
         <w:spacing w:after="80" w:line="300" w:lineRule="auto"/>
       </w:pPr>
@@ -7012,7 +7012,7 @@
         <w:widowControl/>
         <w:numPr>
           <w:ilvl w:val="0"/>
-          <w:numId w:val="11"/>
+          <w:numId w:val="13"/>
         </w:numPr>
         <w:spacing w:after="80" w:line="300" w:lineRule="auto"/>
       </w:pPr>
@@ -7032,7 +7032,7 @@
         <w:widowControl/>
         <w:numPr>
           <w:ilvl w:val="0"/>
-          <w:numId w:val="11"/>
+          <w:numId w:val="13"/>
         </w:numPr>
         <w:spacing w:after="80" w:line="300" w:lineRule="auto"/>
       </w:pPr>
@@ -7052,7 +7052,7 @@
         <w:widowControl/>
         <w:numPr>
           <w:ilvl w:val="0"/>
-          <w:numId w:val="11"/>
+          <w:numId w:val="13"/>
         </w:numPr>
         <w:spacing w:after="80" w:line="300" w:lineRule="auto"/>
       </w:pPr>
@@ -7394,7 +7394,7 @@
                 <w:color w:val="24292F"/>
                 <w:sz w:val="17"/>
               </w:rPr>
-              <w:t xml:space="preserve">  "estado": "PUBLICADA",</w:t>
+              <w:t xml:space="preserve">  "estado": "PUBLISHED",</w:t>
             </w:r>
             <w:r>
               <w:br/>
@@ -9990,7 +9990,7 @@
         <w:widowControl/>
         <w:numPr>
           <w:ilvl w:val="0"/>
-          <w:numId w:val="11"/>
+          <w:numId w:val="14"/>
         </w:numPr>
         <w:spacing w:after="80" w:line="300" w:lineRule="auto"/>
       </w:pPr>
@@ -10010,7 +10010,7 @@
         <w:widowControl/>
         <w:numPr>
           <w:ilvl w:val="0"/>
-          <w:numId w:val="11"/>
+          <w:numId w:val="14"/>
         </w:numPr>
         <w:spacing w:after="80" w:line="300" w:lineRule="auto"/>
       </w:pPr>
@@ -10030,7 +10030,7 @@
         <w:widowControl/>
         <w:numPr>
           <w:ilvl w:val="0"/>
-          <w:numId w:val="11"/>
+          <w:numId w:val="14"/>
         </w:numPr>
         <w:spacing w:after="80" w:line="300" w:lineRule="auto"/>
       </w:pPr>
@@ -10050,7 +10050,7 @@
         <w:widowControl/>
         <w:numPr>
           <w:ilvl w:val="0"/>
-          <w:numId w:val="11"/>
+          <w:numId w:val="14"/>
         </w:numPr>
         <w:spacing w:after="80" w:line="300" w:lineRule="auto"/>
       </w:pPr>
@@ -10070,7 +10070,7 @@
         <w:widowControl/>
         <w:numPr>
           <w:ilvl w:val="0"/>
-          <w:numId w:val="11"/>
+          <w:numId w:val="14"/>
         </w:numPr>
         <w:spacing w:after="80" w:line="300" w:lineRule="auto"/>
       </w:pPr>
@@ -10090,7 +10090,7 @@
         <w:widowControl/>
         <w:numPr>
           <w:ilvl w:val="0"/>
-          <w:numId w:val="11"/>
+          <w:numId w:val="14"/>
         </w:numPr>
         <w:spacing w:after="80" w:line="300" w:lineRule="auto"/>
       </w:pPr>
@@ -10110,7 +10110,7 @@
         <w:widowControl/>
         <w:numPr>
           <w:ilvl w:val="0"/>
-          <w:numId w:val="11"/>
+          <w:numId w:val="14"/>
         </w:numPr>
         <w:spacing w:after="80" w:line="300" w:lineRule="auto"/>
       </w:pPr>
@@ -10130,7 +10130,7 @@
         <w:widowControl/>
         <w:numPr>
           <w:ilvl w:val="0"/>
-          <w:numId w:val="11"/>
+          <w:numId w:val="14"/>
         </w:numPr>
         <w:spacing w:after="80" w:line="300" w:lineRule="auto"/>
       </w:pPr>
@@ -10420,6 +10420,56 @@
           </w:p>
         </w:tc>
       </w:tr>
+      <w:tr>
+        <w:tc>
+          <w:tcPr>
+            <w:tcW w:type="dxa" w:w="3100"/>
+            <w:shd w:fill="FAFBFC"/>
+          </w:tcPr>
+          <w:p>
+            <w:pPr>
+              <w:widowControl/>
+              <w:spacing w:before="0" w:after="0" w:line="252" w:lineRule="auto"/>
+              <w:jc w:val="left"/>
+            </w:pPr>
+            <w:r/>
+            <w:r>
+              <w:rPr>
+                <w:rFonts w:ascii="Calibri" w:hAnsi="Calibri"/>
+                <w:b w:val="0"/>
+                <w:i w:val="0"/>
+                <w:color w:val="000000"/>
+                <w:sz w:val="16"/>
+              </w:rPr>
+              <w:t>Coherencia residual (VRR 2)</w:t>
+            </w:r>
+          </w:p>
+        </w:tc>
+        <w:tc>
+          <w:tcPr>
+            <w:tcW w:type="dxa" w:w="6260"/>
+            <w:shd w:fill="FAFBFC"/>
+          </w:tcPr>
+          <w:p>
+            <w:pPr>
+              <w:widowControl/>
+              <w:spacing w:before="0" w:after="0" w:line="252" w:lineRule="auto"/>
+              <w:jc w:val="left"/>
+            </w:pPr>
+            <w:r/>
+            <w:r>
+              <w:rPr>
+                <w:rFonts w:ascii="Calibri" w:hAnsi="Calibri"/>
+                <w:b w:val="0"/>
+                <w:i w:val="0"/>
+                <w:color w:val="000000"/>
+                <w:sz w:val="16"/>
+              </w:rPr>
+              <w:t>VRR 2 = Frecuencia residual + Impacto residual - 1</w:t>
+            </w:r>
+          </w:p>
+        </w:tc>
+      </w:tr>
     </w:tbl>
     <w:p>
       <w:pPr>
@@ -12303,7 +12353,7 @@
         <w:widowControl/>
         <w:numPr>
           <w:ilvl w:val="0"/>
-          <w:numId w:val="11"/>
+          <w:numId w:val="15"/>
         </w:numPr>
         <w:spacing w:after="80" w:line="300" w:lineRule="auto"/>
       </w:pPr>
@@ -12323,7 +12373,7 @@
         <w:widowControl/>
         <w:numPr>
           <w:ilvl w:val="0"/>
-          <w:numId w:val="11"/>
+          <w:numId w:val="15"/>
         </w:numPr>
         <w:spacing w:after="80" w:line="300" w:lineRule="auto"/>
       </w:pPr>
@@ -12343,7 +12393,7 @@
         <w:widowControl/>
         <w:numPr>
           <w:ilvl w:val="0"/>
-          <w:numId w:val="11"/>
+          <w:numId w:val="15"/>
         </w:numPr>
         <w:spacing w:after="80" w:line="300" w:lineRule="auto"/>
       </w:pPr>
@@ -12363,7 +12413,7 @@
         <w:widowControl/>
         <w:numPr>
           <w:ilvl w:val="0"/>
-          <w:numId w:val="11"/>
+          <w:numId w:val="15"/>
         </w:numPr>
         <w:spacing w:after="80" w:line="300" w:lineRule="auto"/>
       </w:pPr>
@@ -12383,7 +12433,7 @@
         <w:widowControl/>
         <w:numPr>
           <w:ilvl w:val="0"/>
-          <w:numId w:val="11"/>
+          <w:numId w:val="15"/>
         </w:numPr>
         <w:spacing w:after="80" w:line="300" w:lineRule="auto"/>
       </w:pPr>
@@ -12403,7 +12453,7 @@
         <w:widowControl/>
         <w:numPr>
           <w:ilvl w:val="0"/>
-          <w:numId w:val="11"/>
+          <w:numId w:val="15"/>
         </w:numPr>
         <w:spacing w:after="80" w:line="300" w:lineRule="auto"/>
       </w:pPr>
@@ -12423,7 +12473,7 @@
         <w:widowControl/>
         <w:numPr>
           <w:ilvl w:val="0"/>
-          <w:numId w:val="11"/>
+          <w:numId w:val="15"/>
         </w:numPr>
         <w:spacing w:after="80" w:line="300" w:lineRule="auto"/>
       </w:pPr>
@@ -12443,7 +12493,7 @@
         <w:widowControl/>
         <w:numPr>
           <w:ilvl w:val="0"/>
-          <w:numId w:val="11"/>
+          <w:numId w:val="15"/>
         </w:numPr>
         <w:spacing w:after="80" w:line="300" w:lineRule="auto"/>
       </w:pPr>
@@ -12463,7 +12513,7 @@
         <w:widowControl/>
         <w:numPr>
           <w:ilvl w:val="0"/>
-          <w:numId w:val="11"/>
+          <w:numId w:val="15"/>
         </w:numPr>
         <w:spacing w:after="80" w:line="300" w:lineRule="auto"/>
       </w:pPr>
@@ -12483,7 +12533,7 @@
         <w:widowControl/>
         <w:numPr>
           <w:ilvl w:val="0"/>
-          <w:numId w:val="11"/>
+          <w:numId w:val="15"/>
         </w:numPr>
         <w:spacing w:after="80" w:line="300" w:lineRule="auto"/>
       </w:pPr>
@@ -12503,7 +12553,7 @@
         <w:widowControl/>
         <w:numPr>
           <w:ilvl w:val="0"/>
-          <w:numId w:val="11"/>
+          <w:numId w:val="15"/>
         </w:numPr>
         <w:spacing w:after="80" w:line="300" w:lineRule="auto"/>
       </w:pPr>
@@ -12523,7 +12573,7 @@
         <w:widowControl/>
         <w:numPr>
           <w:ilvl w:val="0"/>
-          <w:numId w:val="11"/>
+          <w:numId w:val="15"/>
         </w:numPr>
         <w:spacing w:after="80" w:line="300" w:lineRule="auto"/>
       </w:pPr>
@@ -12543,7 +12593,7 @@
         <w:widowControl/>
         <w:numPr>
           <w:ilvl w:val="0"/>
-          <w:numId w:val="11"/>
+          <w:numId w:val="15"/>
         </w:numPr>
         <w:spacing w:after="80" w:line="300" w:lineRule="auto"/>
       </w:pPr>
@@ -12563,7 +12613,7 @@
         <w:widowControl/>
         <w:numPr>
           <w:ilvl w:val="0"/>
-          <w:numId w:val="11"/>
+          <w:numId w:val="15"/>
         </w:numPr>
         <w:spacing w:after="80" w:line="300" w:lineRule="auto"/>
       </w:pPr>
@@ -16812,6 +16862,472 @@
         <w:t>Este documento constituye la línea base funcional y técnica recomendada para construir el módulo completo de 0 a 100%. Cualquier cambio posterior deberá registrarse, evaluarse y aprobarse mediante el control formal del proyecto.</w:t>
       </w:r>
     </w:p>
+    <w:p>
+      <w:pPr>
+        <w:pStyle w:val="Heading2"/>
+        <w:keepNext/>
+        <w:widowControl/>
+      </w:pPr>
+      <w:r>
+        <w:t>32. Aprobación institucional</w:t>
+      </w:r>
+    </w:p>
+    <w:p>
+      <w:pPr>
+        <w:widowControl/>
+        <w:spacing w:before="0" w:after="120" w:line="300" w:lineRule="auto"/>
+      </w:pPr>
+      <w:r>
+        <w:rPr>
+          <w:rFonts w:ascii="Calibri" w:hAnsi="Calibri"/>
+          <w:b w:val="0"/>
+          <w:i w:val="0"/>
+          <w:color w:val="000000"/>
+          <w:sz w:val="22"/>
+        </w:rPr>
+        <w:t>La versión 1.2 se declara Documento Maestro aprobado para implementación por autorización expresa del propietario de requerimientos. Las firmas podrán completarse conforme al procedimiento institucional.</w:t>
+      </w:r>
+    </w:p>
+    <w:tbl>
+      <w:tblPr>
+        <w:tblW w:type="dxa" w:w="9360"/>
+        <w:jc w:val="left"/>
+        <w:tblLayout w:type="fixed"/>
+        <w:tblLook w:firstColumn="1" w:firstRow="1" w:lastColumn="0" w:lastRow="0" w:noHBand="0" w:noVBand="1" w:val="04A0"/>
+        <w:tblInd w:w="120" w:type="dxa"/>
+        <w:tblBorders>
+          <w:top w:val="single" w:sz="4" w:space="0" w:color="D9D9D9"/>
+          <w:left w:val="single" w:sz="4" w:space="0" w:color="D9D9D9"/>
+          <w:bottom w:val="single" w:sz="4" w:space="0" w:color="D9D9D9"/>
+          <w:right w:val="single" w:sz="4" w:space="0" w:color="D9D9D9"/>
+          <w:insideH w:val="single" w:sz="4" w:space="0" w:color="D9D9D9"/>
+          <w:insideV w:val="single" w:sz="4" w:space="0" w:color="D9D9D9"/>
+        </w:tblBorders>
+      </w:tblPr>
+      <w:tblGrid>
+        <w:gridCol w:w="1800"/>
+        <w:gridCol w:w="3300"/>
+        <w:gridCol w:w="2100"/>
+        <w:gridCol w:w="2160"/>
+      </w:tblGrid>
+      <w:tr>
+        <w:trPr>
+          <w:tblHeader w:val="true"/>
+        </w:trPr>
+        <w:tc>
+          <w:tcPr>
+            <w:tcW w:type="dxa" w:w="1800"/>
+            <w:tcMar>
+              <w:top w:w="80" w:type="dxa"/>
+              <w:bottom w:w="80" w:type="dxa"/>
+              <w:start w:w="120" w:type="dxa"/>
+              <w:end w:w="120" w:type="dxa"/>
+            </w:tcMar>
+            <w:vAlign w:val="center"/>
+            <w:shd w:fill="E8EEF5"/>
+          </w:tcPr>
+          <w:p>
+            <w:pPr>
+              <w:widowControl/>
+              <w:spacing w:before="0" w:after="0" w:line="252" w:lineRule="auto"/>
+              <w:jc w:val="left"/>
+            </w:pPr>
+            <w:r/>
+            <w:r>
+              <w:rPr>
+                <w:rFonts w:ascii="Calibri" w:hAnsi="Calibri"/>
+                <w:b/>
+                <w:i w:val="0"/>
+                <w:color w:val="0B2545"/>
+                <w:sz w:val="17"/>
+              </w:rPr>
+              <w:t>Aprobación</w:t>
+            </w:r>
+          </w:p>
+        </w:tc>
+        <w:tc>
+          <w:tcPr>
+            <w:tcW w:type="dxa" w:w="3300"/>
+            <w:tcMar>
+              <w:top w:w="80" w:type="dxa"/>
+              <w:bottom w:w="80" w:type="dxa"/>
+              <w:start w:w="120" w:type="dxa"/>
+              <w:end w:w="120" w:type="dxa"/>
+            </w:tcMar>
+            <w:vAlign w:val="center"/>
+            <w:shd w:fill="E8EEF5"/>
+          </w:tcPr>
+          <w:p>
+            <w:pPr>
+              <w:widowControl/>
+              <w:spacing w:before="0" w:after="0" w:line="252" w:lineRule="auto"/>
+              <w:jc w:val="left"/>
+            </w:pPr>
+            <w:r/>
+            <w:r>
+              <w:rPr>
+                <w:rFonts w:ascii="Calibri" w:hAnsi="Calibri"/>
+                <w:b/>
+                <w:i w:val="0"/>
+                <w:color w:val="0B2545"/>
+                <w:sz w:val="17"/>
+              </w:rPr>
+              <w:t>Responsable</w:t>
+            </w:r>
+          </w:p>
+        </w:tc>
+        <w:tc>
+          <w:tcPr>
+            <w:tcW w:type="dxa" w:w="2100"/>
+            <w:tcMar>
+              <w:top w:w="80" w:type="dxa"/>
+              <w:bottom w:w="80" w:type="dxa"/>
+              <w:start w:w="120" w:type="dxa"/>
+              <w:end w:w="120" w:type="dxa"/>
+            </w:tcMar>
+            <w:vAlign w:val="center"/>
+            <w:shd w:fill="E8EEF5"/>
+          </w:tcPr>
+          <w:p>
+            <w:pPr>
+              <w:widowControl/>
+              <w:spacing w:before="0" w:after="0" w:line="252" w:lineRule="auto"/>
+              <w:jc w:val="left"/>
+            </w:pPr>
+            <w:r/>
+            <w:r>
+              <w:rPr>
+                <w:rFonts w:ascii="Calibri" w:hAnsi="Calibri"/>
+                <w:b/>
+                <w:i w:val="0"/>
+                <w:color w:val="0B2545"/>
+                <w:sz w:val="17"/>
+              </w:rPr>
+              <w:t>Fecha</w:t>
+            </w:r>
+          </w:p>
+        </w:tc>
+        <w:tc>
+          <w:tcPr>
+            <w:tcW w:type="dxa" w:w="2160"/>
+            <w:tcMar>
+              <w:top w:w="80" w:type="dxa"/>
+              <w:bottom w:w="80" w:type="dxa"/>
+              <w:start w:w="120" w:type="dxa"/>
+              <w:end w:w="120" w:type="dxa"/>
+            </w:tcMar>
+            <w:vAlign w:val="center"/>
+            <w:shd w:fill="E8EEF5"/>
+          </w:tcPr>
+          <w:p>
+            <w:pPr>
+              <w:widowControl/>
+              <w:spacing w:before="0" w:after="0" w:line="252" w:lineRule="auto"/>
+              <w:jc w:val="left"/>
+            </w:pPr>
+            <w:r/>
+            <w:r>
+              <w:rPr>
+                <w:rFonts w:ascii="Calibri" w:hAnsi="Calibri"/>
+                <w:b/>
+                <w:i w:val="0"/>
+                <w:color w:val="0B2545"/>
+                <w:sz w:val="17"/>
+              </w:rPr>
+              <w:t>Firma</w:t>
+            </w:r>
+          </w:p>
+        </w:tc>
+      </w:tr>
+      <w:tr>
+        <w:tc>
+          <w:tcPr>
+            <w:tcW w:type="dxa" w:w="1800"/>
+          </w:tcPr>
+          <w:p>
+            <w:pPr>
+              <w:widowControl/>
+              <w:spacing w:before="0" w:after="0" w:line="252" w:lineRule="auto"/>
+              <w:jc w:val="left"/>
+            </w:pPr>
+            <w:r/>
+            <w:r>
+              <w:rPr>
+                <w:rFonts w:ascii="Calibri" w:hAnsi="Calibri"/>
+                <w:b w:val="0"/>
+                <w:i w:val="0"/>
+                <w:color w:val="000000"/>
+                <w:sz w:val="17"/>
+              </w:rPr>
+              <w:t>Elaborado por</w:t>
+            </w:r>
+          </w:p>
+        </w:tc>
+        <w:tc>
+          <w:tcPr>
+            <w:tcW w:type="dxa" w:w="3300"/>
+          </w:tcPr>
+          <w:p>
+            <w:pPr>
+              <w:widowControl/>
+              <w:spacing w:before="0" w:after="0" w:line="252" w:lineRule="auto"/>
+              <w:jc w:val="left"/>
+            </w:pPr>
+            <w:r/>
+            <w:r>
+              <w:rPr>
+                <w:rFonts w:ascii="Calibri" w:hAnsi="Calibri"/>
+                <w:b w:val="0"/>
+                <w:i w:val="0"/>
+                <w:color w:val="000000"/>
+                <w:sz w:val="17"/>
+              </w:rPr>
+              <w:t>Codex / equipo colaborador</w:t>
+            </w:r>
+          </w:p>
+        </w:tc>
+        <w:tc>
+          <w:tcPr>
+            <w:tcW w:type="dxa" w:w="2100"/>
+          </w:tcPr>
+          <w:p>
+            <w:pPr>
+              <w:widowControl/>
+              <w:spacing w:before="0" w:after="0" w:line="252" w:lineRule="auto"/>
+              <w:jc w:val="left"/>
+            </w:pPr>
+            <w:r/>
+            <w:r>
+              <w:rPr>
+                <w:rFonts w:ascii="Calibri" w:hAnsi="Calibri"/>
+                <w:b w:val="0"/>
+                <w:i w:val="0"/>
+                <w:color w:val="000000"/>
+                <w:sz w:val="17"/>
+              </w:rPr>
+              <w:t>30 de julio de 2026</w:t>
+            </w:r>
+          </w:p>
+        </w:tc>
+        <w:tc>
+          <w:tcPr>
+            <w:tcW w:type="dxa" w:w="2160"/>
+          </w:tcPr>
+          <w:p>
+            <w:pPr>
+              <w:widowControl/>
+              <w:spacing w:before="0" w:after="0" w:line="252" w:lineRule="auto"/>
+              <w:jc w:val="left"/>
+            </w:pPr>
+            <w:r/>
+            <w:r>
+              <w:rPr>
+                <w:rFonts w:ascii="Calibri" w:hAnsi="Calibri"/>
+                <w:b w:val="0"/>
+                <w:i w:val="0"/>
+                <w:color w:val="000000"/>
+                <w:sz w:val="17"/>
+              </w:rPr>
+            </w:r>
+          </w:p>
+        </w:tc>
+      </w:tr>
+      <w:tr>
+        <w:tc>
+          <w:tcPr>
+            <w:tcW w:type="dxa" w:w="1800"/>
+            <w:shd w:fill="FAFBFC"/>
+          </w:tcPr>
+          <w:p>
+            <w:pPr>
+              <w:widowControl/>
+              <w:spacing w:before="0" w:after="0" w:line="252" w:lineRule="auto"/>
+              <w:jc w:val="left"/>
+            </w:pPr>
+            <w:r/>
+            <w:r>
+              <w:rPr>
+                <w:rFonts w:ascii="Calibri" w:hAnsi="Calibri"/>
+                <w:b w:val="0"/>
+                <w:i w:val="0"/>
+                <w:color w:val="000000"/>
+                <w:sz w:val="17"/>
+              </w:rPr>
+              <w:t>Revisado por</w:t>
+            </w:r>
+          </w:p>
+        </w:tc>
+        <w:tc>
+          <w:tcPr>
+            <w:tcW w:type="dxa" w:w="3300"/>
+            <w:shd w:fill="FAFBFC"/>
+          </w:tcPr>
+          <w:p>
+            <w:pPr>
+              <w:widowControl/>
+              <w:spacing w:before="0" w:after="0" w:line="252" w:lineRule="auto"/>
+              <w:jc w:val="left"/>
+            </w:pPr>
+            <w:r/>
+            <w:r>
+              <w:rPr>
+                <w:rFonts w:ascii="Calibri" w:hAnsi="Calibri"/>
+                <w:b w:val="0"/>
+                <w:i w:val="0"/>
+                <w:color w:val="000000"/>
+                <w:sz w:val="17"/>
+              </w:rPr>
+              <w:t>Equipo técnico y funcional</w:t>
+            </w:r>
+          </w:p>
+        </w:tc>
+        <w:tc>
+          <w:tcPr>
+            <w:tcW w:type="dxa" w:w="2100"/>
+            <w:shd w:fill="FAFBFC"/>
+          </w:tcPr>
+          <w:p>
+            <w:pPr>
+              <w:widowControl/>
+              <w:spacing w:before="0" w:after="0" w:line="252" w:lineRule="auto"/>
+              <w:jc w:val="left"/>
+            </w:pPr>
+            <w:r/>
+            <w:r>
+              <w:rPr>
+                <w:rFonts w:ascii="Calibri" w:hAnsi="Calibri"/>
+                <w:b w:val="0"/>
+                <w:i w:val="0"/>
+                <w:color w:val="000000"/>
+                <w:sz w:val="17"/>
+              </w:rPr>
+            </w:r>
+          </w:p>
+        </w:tc>
+        <w:tc>
+          <w:tcPr>
+            <w:tcW w:type="dxa" w:w="2160"/>
+            <w:shd w:fill="FAFBFC"/>
+          </w:tcPr>
+          <w:p>
+            <w:pPr>
+              <w:widowControl/>
+              <w:spacing w:before="0" w:after="0" w:line="252" w:lineRule="auto"/>
+              <w:jc w:val="left"/>
+            </w:pPr>
+            <w:r/>
+            <w:r>
+              <w:rPr>
+                <w:rFonts w:ascii="Calibri" w:hAnsi="Calibri"/>
+                <w:b w:val="0"/>
+                <w:i w:val="0"/>
+                <w:color w:val="000000"/>
+                <w:sz w:val="17"/>
+              </w:rPr>
+            </w:r>
+          </w:p>
+        </w:tc>
+      </w:tr>
+      <w:tr>
+        <w:tc>
+          <w:tcPr>
+            <w:tcW w:type="dxa" w:w="1800"/>
+          </w:tcPr>
+          <w:p>
+            <w:pPr>
+              <w:widowControl/>
+              <w:spacing w:before="0" w:after="0" w:line="252" w:lineRule="auto"/>
+              <w:jc w:val="left"/>
+            </w:pPr>
+            <w:r/>
+            <w:r>
+              <w:rPr>
+                <w:rFonts w:ascii="Calibri" w:hAnsi="Calibri"/>
+                <w:b w:val="0"/>
+                <w:i w:val="0"/>
+                <w:color w:val="000000"/>
+                <w:sz w:val="17"/>
+              </w:rPr>
+              <w:t>Aprobado por</w:t>
+            </w:r>
+          </w:p>
+        </w:tc>
+        <w:tc>
+          <w:tcPr>
+            <w:tcW w:type="dxa" w:w="3300"/>
+          </w:tcPr>
+          <w:p>
+            <w:pPr>
+              <w:widowControl/>
+              <w:spacing w:before="0" w:after="0" w:line="252" w:lineRule="auto"/>
+              <w:jc w:val="left"/>
+            </w:pPr>
+            <w:r/>
+            <w:r>
+              <w:rPr>
+                <w:rFonts w:ascii="Calibri" w:hAnsi="Calibri"/>
+                <w:b w:val="0"/>
+                <w:i w:val="0"/>
+                <w:color w:val="000000"/>
+                <w:sz w:val="17"/>
+              </w:rPr>
+              <w:t>Javier Mejía</w:t>
+            </w:r>
+          </w:p>
+        </w:tc>
+        <w:tc>
+          <w:tcPr>
+            <w:tcW w:type="dxa" w:w="2100"/>
+          </w:tcPr>
+          <w:p>
+            <w:pPr>
+              <w:widowControl/>
+              <w:spacing w:before="0" w:after="0" w:line="252" w:lineRule="auto"/>
+              <w:jc w:val="left"/>
+            </w:pPr>
+            <w:r/>
+            <w:r>
+              <w:rPr>
+                <w:rFonts w:ascii="Calibri" w:hAnsi="Calibri"/>
+                <w:b w:val="0"/>
+                <w:i w:val="0"/>
+                <w:color w:val="000000"/>
+                <w:sz w:val="17"/>
+              </w:rPr>
+              <w:t>30 de julio de 2026</w:t>
+            </w:r>
+          </w:p>
+        </w:tc>
+        <w:tc>
+          <w:tcPr>
+            <w:tcW w:type="dxa" w:w="2160"/>
+          </w:tcPr>
+          <w:p>
+            <w:pPr>
+              <w:widowControl/>
+              <w:spacing w:before="0" w:after="0" w:line="252" w:lineRule="auto"/>
+              <w:jc w:val="left"/>
+            </w:pPr>
+            <w:r/>
+            <w:r>
+              <w:rPr>
+                <w:rFonts w:ascii="Calibri" w:hAnsi="Calibri"/>
+                <w:b w:val="0"/>
+                <w:i w:val="0"/>
+                <w:color w:val="000000"/>
+                <w:sz w:val="17"/>
+              </w:rPr>
+            </w:r>
+          </w:p>
+        </w:tc>
+      </w:tr>
+    </w:tbl>
+    <w:p>
+      <w:pPr>
+        <w:widowControl/>
+        <w:spacing w:after="40"/>
+      </w:pPr>
+    </w:p>
     <w:sectPr>
       <w:headerReference w:type="default" r:id="rId9"/>
       <w:footerReference w:type="default" r:id="rId10"/>
@@ -17122,6 +17638,18 @@
     </w:lvl>
   </w:abstractNum>
   <w:num w:numId="11">
+    <w:abstractNumId w:val="10"/>
+  </w:num>
+  <w:num w:numId="12">
+    <w:abstractNumId w:val="10"/>
+  </w:num>
+  <w:num w:numId="13">
+    <w:abstractNumId w:val="10"/>
+  </w:num>
+  <w:num w:numId="14">
+    <w:abstractNumId w:val="10"/>
+  </w:num>
+  <w:num w:numId="15">
     <w:abstractNumId w:val="10"/>
   </w:num>
 </w:numbering>

</xml_diff>

<commit_message>
docs(matrices-riesgos): cerrar documento maestro v1.2
</commit_message>
<xml_diff>
--- a/Analisis Matrices de riesgos v2/Analisis_Definitivo_Modulo_Matrices_de_Riesgos.docx
+++ b/Analisis Matrices de riesgos v2/Analisis_Definitivo_Modulo_Matrices_de_Riesgos.docx
@@ -16885,7 +16885,7 @@
           <w:color w:val="000000"/>
           <w:sz w:val="22"/>
         </w:rPr>
-        <w:t>La versión 1.2 se declara Documento Maestro aprobado para implementación por autorización expresa del propietario de requerimientos. Las firmas podrán completarse conforme al procedimiento institucional.</w:t>
+        <w:t>La versión 1.2 se declara Documento Maestro aprobado para implementación por autorización expresa del propietario de requerimientos. La trazabilidad electrónica de elaboración, revisión y aprobación queda registrada en el control documental y en la bitácora de colaboración; cualquier firma manuscrita o digital adicional se gestionará conforme al procedimiento institucional.</w:t>
       </w:r>
     </w:p>
     <w:tbl>
@@ -17034,7 +17034,7 @@
                 <w:color w:val="0B2545"/>
                 <w:sz w:val="17"/>
               </w:rPr>
-              <w:t>Firma</w:t>
+              <w:t>Constancia de control</w:t>
             </w:r>
           </w:p>
         </w:tc>
@@ -17082,7 +17082,7 @@
                 <w:color w:val="000000"/>
                 <w:sz w:val="17"/>
               </w:rPr>
-              <w:t>Codex / equipo colaborador</w:t>
+              <w:t>Equipo técnico del proyecto</w:t>
             </w:r>
           </w:p>
         </w:tc>
@@ -17128,6 +17128,7 @@
                 <w:color w:val="000000"/>
                 <w:sz w:val="17"/>
               </w:rPr>
+              <w:t>Documento preparado</w:t>
             </w:r>
           </w:p>
         </w:tc>
@@ -17177,7 +17178,7 @@
                 <w:color w:val="000000"/>
                 <w:sz w:val="17"/>
               </w:rPr>
-              <w:t>Equipo técnico y funcional</w:t>
+              <w:t>Equipo técnico y funcional del proyecto</w:t>
             </w:r>
           </w:p>
         </w:tc>
@@ -17201,6 +17202,7 @@
                 <w:color w:val="000000"/>
                 <w:sz w:val="17"/>
               </w:rPr>
+              <w:t>30 de julio de 2026</w:t>
             </w:r>
           </w:p>
         </w:tc>
@@ -17224,6 +17226,7 @@
                 <w:color w:val="000000"/>
                 <w:sz w:val="17"/>
               </w:rPr>
+              <w:t>Revisión incorporada</w:t>
             </w:r>
           </w:p>
         </w:tc>
@@ -17317,6 +17320,7 @@
                 <w:color w:val="000000"/>
                 <w:sz w:val="17"/>
               </w:rPr>
+              <w:t>Aprobación expresa registrada</w:t>
             </w:r>
           </w:p>
         </w:tc>
@@ -17642,15 +17646,27 @@
   </w:num>
   <w:num w:numId="12">
     <w:abstractNumId w:val="10"/>
+    <w:lvlOverride w:ilvl="0">
+      <w:startOverride w:val="1"/>
+    </w:lvlOverride>
   </w:num>
   <w:num w:numId="13">
     <w:abstractNumId w:val="10"/>
+    <w:lvlOverride w:ilvl="0">
+      <w:startOverride w:val="1"/>
+    </w:lvlOverride>
   </w:num>
   <w:num w:numId="14">
     <w:abstractNumId w:val="10"/>
+    <w:lvlOverride w:ilvl="0">
+      <w:startOverride w:val="1"/>
+    </w:lvlOverride>
   </w:num>
   <w:num w:numId="15">
     <w:abstractNumId w:val="10"/>
+    <w:lvlOverride w:ilvl="0">
+      <w:startOverride w:val="1"/>
+    </w:lvlOverride>
   </w:num>
 </w:numbering>
 </file>

</xml_diff>